<commit_message>
feat: update placeholders to match new templates
Resume placeholders:
- [INTRODUCTION] (was long description)
- [W1-B1], [W1-B2], [W1-B3] (Auraia)
- [W2-B1] (RC Group)
- [W3-B1] (Europ Assistance)
- [L-B1], [L-B2], [L-B3] (Leadership)
- [COURSEWORK], [SOFTWARE]

Cover letter placeholders:
- Added [SUBJECT_LINE]

Co-Authored-By: Claude Opus 4.5 <noreply@anthropic.com>
</commit_message>
<xml_diff>
--- a/templates/Cover Letter - Adrian Turion.docx
+++ b/templates/Cover Letter - Adrian Turion.docx
@@ -5,11 +5,16 @@
     <w:p>
       <w:pPr>
         <w:jc w:val="right"/>
+        <w:rPr>
+          <w:sz w:val="20"/>
+          <w:szCs w:val="20"/>
+        </w:rPr>
       </w:pPr>
       <w:r>
         <w:rPr>
           <w:rFonts w:ascii="Times New Roman" w:hAnsi="Times New Roman"/>
           <w:sz w:val="20"/>
+          <w:szCs w:val="20"/>
         </w:rPr>
         <w:t>Adrian Turion</w:t>
       </w:r>
@@ -17,6 +22,7 @@
         <w:rPr>
           <w:rFonts w:ascii="Times New Roman" w:hAnsi="Times New Roman"/>
           <w:sz w:val="20"/>
+          <w:szCs w:val="20"/>
         </w:rPr>
         <w:br/>
         <w:t>Avenue de Sainte Clotilde 9</w:t>
@@ -25,6 +31,7 @@
         <w:rPr>
           <w:rFonts w:ascii="Times New Roman" w:hAnsi="Times New Roman"/>
           <w:sz w:val="20"/>
+          <w:szCs w:val="20"/>
         </w:rPr>
         <w:br/>
         <w:t>1205 Geneva, Switzerland</w:t>
@@ -33,6 +40,7 @@
         <w:rPr>
           <w:rFonts w:ascii="Times New Roman" w:hAnsi="Times New Roman"/>
           <w:sz w:val="20"/>
+          <w:szCs w:val="20"/>
         </w:rPr>
         <w:br/>
         <w:t>+41 77 262 37 96</w:t>
@@ -41,26 +49,43 @@
         <w:rPr>
           <w:rFonts w:ascii="Times New Roman" w:hAnsi="Times New Roman"/>
           <w:sz w:val="20"/>
+          <w:szCs w:val="20"/>
         </w:rPr>
         <w:br/>
         <w:t>turionadrian@gmail.com</w:t>
       </w:r>
     </w:p>
     <w:p>
+      <w:pPr>
+        <w:rPr>
+          <w:sz w:val="20"/>
+          <w:szCs w:val="20"/>
+        </w:rPr>
+      </w:pPr>
       <w:r>
         <w:rPr>
           <w:rFonts w:ascii="Times New Roman" w:hAnsi="Times New Roman"/>
           <w:sz w:val="20"/>
+          <w:szCs w:val="20"/>
         </w:rPr>
         <w:t>[DATE]</w:t>
       </w:r>
     </w:p>
     <w:p>
+      <w:pPr>
+        <w:rPr>
+          <w:rFonts w:ascii="Times New Roman" w:hAnsi="Times New Roman"/>
+          <w:b/>
+          <w:sz w:val="20"/>
+          <w:szCs w:val="20"/>
+        </w:rPr>
+      </w:pPr>
       <w:r>
         <w:rPr>
           <w:rFonts w:ascii="Times New Roman" w:hAnsi="Times New Roman"/>
           <w:b/>
           <w:sz w:val="20"/>
+          <w:szCs w:val="20"/>
         </w:rPr>
         <w:t>[RECIPIENT_NAME]</w:t>
       </w:r>
@@ -69,6 +94,7 @@
           <w:rFonts w:ascii="Times New Roman" w:hAnsi="Times New Roman"/>
           <w:b/>
           <w:sz w:val="20"/>
+          <w:szCs w:val="20"/>
         </w:rPr>
         <w:br/>
         <w:t>[STREET_NUMBER]</w:t>
@@ -78,6 +104,7 @@
           <w:rFonts w:ascii="Times New Roman" w:hAnsi="Times New Roman"/>
           <w:b/>
           <w:sz w:val="20"/>
+          <w:szCs w:val="20"/>
         </w:rPr>
         <w:br/>
         <w:t>[POSTAL_CITY_COUNTRY]</w:t>
@@ -87,25 +114,75 @@
           <w:rFonts w:ascii="Times New Roman" w:hAnsi="Times New Roman"/>
           <w:b/>
           <w:sz w:val="20"/>
+          <w:szCs w:val="20"/>
         </w:rPr>
         <w:br/>
         <w:t>[COMPANY_NAME]</w:t>
       </w:r>
     </w:p>
     <w:p>
+      <w:pPr>
+        <w:rPr>
+          <w:sz w:val="20"/>
+          <w:szCs w:val="20"/>
+        </w:rPr>
+      </w:pPr>
+      <w:r>
+        <w:rPr>
+          <w:rFonts w:ascii="Times New Roman" w:hAnsi="Times New Roman"/>
+          <w:b/>
+          <w:sz w:val="20"/>
+          <w:szCs w:val="20"/>
+        </w:rPr>
+        <w:t>[</w:t>
+      </w:r>
+      <w:r>
+        <w:rPr>
+          <w:rFonts w:ascii="Times New Roman" w:hAnsi="Times New Roman"/>
+          <w:b/>
+          <w:sz w:val="20"/>
+          <w:szCs w:val="20"/>
+        </w:rPr>
+        <w:t>SUBJECT_LINE</w:t>
+      </w:r>
+      <w:r>
+        <w:rPr>
+          <w:rFonts w:ascii="Times New Roman" w:hAnsi="Times New Roman"/>
+          <w:b/>
+          <w:sz w:val="20"/>
+          <w:szCs w:val="20"/>
+        </w:rPr>
+        <w:t>]</w:t>
+      </w:r>
+    </w:p>
+    <w:p>
+      <w:pPr>
+        <w:rPr>
+          <w:sz w:val="20"/>
+          <w:szCs w:val="20"/>
+        </w:rPr>
+      </w:pPr>
       <w:r>
         <w:rPr>
           <w:rFonts w:ascii="Times New Roman" w:hAnsi="Times New Roman"/>
           <w:sz w:val="20"/>
+          <w:szCs w:val="20"/>
         </w:rPr>
         <w:t>[SALUTATION]</w:t>
       </w:r>
     </w:p>
     <w:p>
+      <w:pPr>
+        <w:rPr>
+          <w:sz w:val="20"/>
+          <w:szCs w:val="20"/>
+        </w:rPr>
+      </w:pPr>
       <w:r>
         <w:rPr>
           <w:rFonts w:ascii="Times New Roman" w:hAnsi="Times New Roman"/>
           <w:sz w:val="20"/>
+          <w:szCs w:val="20"/>
         </w:rPr>
         <w:t>[INTRO_PARAGRAPH]</w:t>
       </w:r>
@@ -115,6 +192,8 @@
         <w:rPr>
           <w:b/>
           <w:bCs/>
+          <w:sz w:val="20"/>
+          <w:szCs w:val="20"/>
         </w:rPr>
       </w:pPr>
       <w:r>
@@ -123,6 +202,7 @@
           <w:b/>
           <w:bCs/>
           <w:sz w:val="20"/>
+          <w:szCs w:val="20"/>
         </w:rPr>
         <w:t>I believe I'm a great fit for three main reasons:</w:t>
       </w:r>
@@ -134,11 +214,16 @@
           <w:ilvl w:val="0"/>
           <w:numId w:val="10"/>
         </w:numPr>
+        <w:rPr>
+          <w:sz w:val="20"/>
+          <w:szCs w:val="20"/>
+        </w:rPr>
       </w:pPr>
       <w:r>
         <w:rPr>
           <w:rFonts w:ascii="Times New Roman" w:hAnsi="Times New Roman"/>
           <w:sz w:val="20"/>
+          <w:szCs w:val="20"/>
         </w:rPr>
         <w:t>[BODY_PARAGRAPH_1]</w:t>
       </w:r>
@@ -150,11 +235,16 @@
           <w:ilvl w:val="0"/>
           <w:numId w:val="10"/>
         </w:numPr>
+        <w:rPr>
+          <w:sz w:val="20"/>
+          <w:szCs w:val="20"/>
+        </w:rPr>
       </w:pPr>
       <w:r>
         <w:rPr>
           <w:rFonts w:ascii="Times New Roman" w:hAnsi="Times New Roman"/>
           <w:sz w:val="20"/>
+          <w:szCs w:val="20"/>
         </w:rPr>
         <w:t>[BODY_PARAGRAPH_2]</w:t>
       </w:r>
@@ -166,56 +256,96 @@
           <w:ilvl w:val="0"/>
           <w:numId w:val="10"/>
         </w:numPr>
+        <w:rPr>
+          <w:sz w:val="20"/>
+          <w:szCs w:val="20"/>
+        </w:rPr>
       </w:pPr>
       <w:r>
         <w:rPr>
           <w:rFonts w:ascii="Times New Roman" w:hAnsi="Times New Roman"/>
           <w:sz w:val="20"/>
+          <w:szCs w:val="20"/>
         </w:rPr>
         <w:t>[BODY_PARAGRAPH_3]</w:t>
       </w:r>
     </w:p>
     <w:p>
+      <w:pPr>
+        <w:rPr>
+          <w:sz w:val="20"/>
+          <w:szCs w:val="20"/>
+        </w:rPr>
+      </w:pPr>
       <w:r>
         <w:rPr>
           <w:rFonts w:ascii="Times New Roman" w:hAnsi="Times New Roman"/>
           <w:sz w:val="20"/>
+          <w:szCs w:val="20"/>
         </w:rPr>
         <w:t>[ADDITIONAL_CONTEXT]</w:t>
       </w:r>
     </w:p>
     <w:p>
+      <w:pPr>
+        <w:rPr>
+          <w:sz w:val="20"/>
+          <w:szCs w:val="20"/>
+        </w:rPr>
+      </w:pPr>
       <w:r>
         <w:rPr>
           <w:rFonts w:ascii="Times New Roman" w:hAnsi="Times New Roman"/>
           <w:sz w:val="20"/>
+          <w:szCs w:val="20"/>
         </w:rPr>
         <w:t>[COMPANY_ATTRACTION]</w:t>
       </w:r>
     </w:p>
     <w:p>
+      <w:pPr>
+        <w:rPr>
+          <w:sz w:val="20"/>
+          <w:szCs w:val="20"/>
+        </w:rPr>
+      </w:pPr>
       <w:r>
         <w:rPr>
           <w:rFonts w:ascii="Times New Roman" w:hAnsi="Times New Roman"/>
           <w:sz w:val="20"/>
+          <w:szCs w:val="20"/>
         </w:rPr>
         <w:t>[CLOSING_PARAGRAPH]</w:t>
       </w:r>
     </w:p>
     <w:p>
+      <w:pPr>
+        <w:rPr>
+          <w:sz w:val="20"/>
+          <w:szCs w:val="20"/>
+        </w:rPr>
+      </w:pPr>
       <w:r>
         <w:rPr>
           <w:rFonts w:ascii="Times New Roman" w:hAnsi="Times New Roman"/>
           <w:sz w:val="20"/>
+          <w:szCs w:val="20"/>
         </w:rPr>
         <w:t>Thank you for your time and consideration.</w:t>
       </w:r>
     </w:p>
     <w:p>
+      <w:pPr>
+        <w:rPr>
+          <w:sz w:val="20"/>
+          <w:szCs w:val="20"/>
+        </w:rPr>
+      </w:pPr>
       <w:r>
         <w:rPr>
           <w:rFonts w:ascii="Times New Roman" w:hAnsi="Times New Roman"/>
           <w:sz w:val="20"/>
+          <w:szCs w:val="20"/>
         </w:rPr>
         <w:t>Sincerely,</w:t>
       </w:r>
@@ -223,12 +353,15 @@
         <w:rPr>
           <w:rFonts w:ascii="Times New Roman" w:hAnsi="Times New Roman"/>
           <w:sz w:val="20"/>
+          <w:szCs w:val="20"/>
         </w:rPr>
         <w:br/>
       </w:r>
       <w:r>
         <w:rPr>
           <w:noProof/>
+          <w:sz w:val="20"/>
+          <w:szCs w:val="20"/>
           <w:lang w:val="en-GB"/>
         </w:rPr>
         <w:drawing>
@@ -10109,7 +10242,7 @@
       </w:tcPr>
     </w:tblStylePr>
   </w:style>
-  <w:style w:type="table" w:styleId="ColourfulShading">
+  <w:style w:type="table" w:styleId="ColorfulShading">
     <w:name w:val="Colorful Shading"/>
     <w:basedOn w:val="TableNormal"/>
     <w:uiPriority w:val="71"/>
@@ -10224,7 +10357,7 @@
       </w:rPr>
     </w:tblStylePr>
   </w:style>
-  <w:style w:type="table" w:styleId="ColourfulShadingAccent1">
+  <w:style w:type="table" w:styleId="ColorfulShading-Accent1">
     <w:name w:val="Colorful Shading Accent 1"/>
     <w:basedOn w:val="TableNormal"/>
     <w:uiPriority w:val="71"/>
@@ -10339,7 +10472,7 @@
       </w:rPr>
     </w:tblStylePr>
   </w:style>
-  <w:style w:type="table" w:styleId="ColourfulShadingAccent2">
+  <w:style w:type="table" w:styleId="ColorfulShading-Accent2">
     <w:name w:val="Colorful Shading Accent 2"/>
     <w:basedOn w:val="TableNormal"/>
     <w:uiPriority w:val="71"/>
@@ -10454,7 +10587,7 @@
       </w:rPr>
     </w:tblStylePr>
   </w:style>
-  <w:style w:type="table" w:styleId="ColourfulShadingAccent3">
+  <w:style w:type="table" w:styleId="ColorfulShading-Accent3">
     <w:name w:val="Colorful Shading Accent 3"/>
     <w:basedOn w:val="TableNormal"/>
     <w:uiPriority w:val="71"/>
@@ -10559,7 +10692,7 @@
       </w:tcPr>
     </w:tblStylePr>
   </w:style>
-  <w:style w:type="table" w:styleId="ColourfulShadingAccent4">
+  <w:style w:type="table" w:styleId="ColorfulShading-Accent4">
     <w:name w:val="Colorful Shading Accent 4"/>
     <w:basedOn w:val="TableNormal"/>
     <w:uiPriority w:val="71"/>
@@ -10674,7 +10807,7 @@
       </w:rPr>
     </w:tblStylePr>
   </w:style>
-  <w:style w:type="table" w:styleId="ColourfulShadingAccent5">
+  <w:style w:type="table" w:styleId="ColorfulShading-Accent5">
     <w:name w:val="Colorful Shading Accent 5"/>
     <w:basedOn w:val="TableNormal"/>
     <w:uiPriority w:val="71"/>
@@ -10789,7 +10922,7 @@
       </w:rPr>
     </w:tblStylePr>
   </w:style>
-  <w:style w:type="table" w:styleId="ColourfulShadingAccent6">
+  <w:style w:type="table" w:styleId="ColorfulShading-Accent6">
     <w:name w:val="Colorful Shading Accent 6"/>
     <w:basedOn w:val="TableNormal"/>
     <w:uiPriority w:val="71"/>
@@ -10904,7 +11037,7 @@
       </w:rPr>
     </w:tblStylePr>
   </w:style>
-  <w:style w:type="table" w:styleId="ColourfulList">
+  <w:style w:type="table" w:styleId="ColorfulList">
     <w:name w:val="Colorful List"/>
     <w:basedOn w:val="TableNormal"/>
     <w:uiPriority w:val="72"/>
@@ -10983,7 +11116,7 @@
       </w:tcPr>
     </w:tblStylePr>
   </w:style>
-  <w:style w:type="table" w:styleId="ColourfulListAccent1">
+  <w:style w:type="table" w:styleId="ColorfulList-Accent1">
     <w:name w:val="Colorful List Accent 1"/>
     <w:basedOn w:val="TableNormal"/>
     <w:uiPriority w:val="72"/>
@@ -11062,7 +11195,7 @@
       </w:tcPr>
     </w:tblStylePr>
   </w:style>
-  <w:style w:type="table" w:styleId="ColourfulListAccent2">
+  <w:style w:type="table" w:styleId="ColorfulList-Accent2">
     <w:name w:val="Colorful List Accent 2"/>
     <w:basedOn w:val="TableNormal"/>
     <w:uiPriority w:val="72"/>
@@ -11141,7 +11274,7 @@
       </w:tcPr>
     </w:tblStylePr>
   </w:style>
-  <w:style w:type="table" w:styleId="ColourfulListAccent3">
+  <w:style w:type="table" w:styleId="ColorfulList-Accent3">
     <w:name w:val="Colorful List Accent 3"/>
     <w:basedOn w:val="TableNormal"/>
     <w:uiPriority w:val="72"/>
@@ -11220,7 +11353,7 @@
       </w:tcPr>
     </w:tblStylePr>
   </w:style>
-  <w:style w:type="table" w:styleId="ColourfulListAccent4">
+  <w:style w:type="table" w:styleId="ColorfulList-Accent4">
     <w:name w:val="Colorful List Accent 4"/>
     <w:basedOn w:val="TableNormal"/>
     <w:uiPriority w:val="72"/>
@@ -11299,7 +11432,7 @@
       </w:tcPr>
     </w:tblStylePr>
   </w:style>
-  <w:style w:type="table" w:styleId="ColourfulListAccent5">
+  <w:style w:type="table" w:styleId="ColorfulList-Accent5">
     <w:name w:val="Colorful List Accent 5"/>
     <w:basedOn w:val="TableNormal"/>
     <w:uiPriority w:val="72"/>
@@ -11378,7 +11511,7 @@
       </w:tcPr>
     </w:tblStylePr>
   </w:style>
-  <w:style w:type="table" w:styleId="ColourfulListAccent6">
+  <w:style w:type="table" w:styleId="ColorfulList-Accent6">
     <w:name w:val="Colorful List Accent 6"/>
     <w:basedOn w:val="TableNormal"/>
     <w:uiPriority w:val="72"/>
@@ -11457,7 +11590,7 @@
       </w:tcPr>
     </w:tblStylePr>
   </w:style>
-  <w:style w:type="table" w:styleId="ColourfulGrid">
+  <w:style w:type="table" w:styleId="ColorfulGrid">
     <w:name w:val="Colorful Grid"/>
     <w:basedOn w:val="TableNormal"/>
     <w:uiPriority w:val="73"/>
@@ -11530,7 +11663,7 @@
       </w:tcPr>
     </w:tblStylePr>
   </w:style>
-  <w:style w:type="table" w:styleId="ColourfulGridAccent1">
+  <w:style w:type="table" w:styleId="ColorfulGrid-Accent1">
     <w:name w:val="Colorful Grid Accent 1"/>
     <w:basedOn w:val="TableNormal"/>
     <w:uiPriority w:val="73"/>
@@ -11603,7 +11736,7 @@
       </w:tcPr>
     </w:tblStylePr>
   </w:style>
-  <w:style w:type="table" w:styleId="ColourfulGridAccent2">
+  <w:style w:type="table" w:styleId="ColorfulGrid-Accent2">
     <w:name w:val="Colorful Grid Accent 2"/>
     <w:basedOn w:val="TableNormal"/>
     <w:uiPriority w:val="73"/>
@@ -11676,7 +11809,7 @@
       </w:tcPr>
     </w:tblStylePr>
   </w:style>
-  <w:style w:type="table" w:styleId="ColourfulGridAccent3">
+  <w:style w:type="table" w:styleId="ColorfulGrid-Accent3">
     <w:name w:val="Colorful Grid Accent 3"/>
     <w:basedOn w:val="TableNormal"/>
     <w:uiPriority w:val="73"/>
@@ -11749,7 +11882,7 @@
       </w:tcPr>
     </w:tblStylePr>
   </w:style>
-  <w:style w:type="table" w:styleId="ColourfulGridAccent4">
+  <w:style w:type="table" w:styleId="ColorfulGrid-Accent4">
     <w:name w:val="Colorful Grid Accent 4"/>
     <w:basedOn w:val="TableNormal"/>
     <w:uiPriority w:val="73"/>
@@ -11822,7 +11955,7 @@
       </w:tcPr>
     </w:tblStylePr>
   </w:style>
-  <w:style w:type="table" w:styleId="ColourfulGridAccent5">
+  <w:style w:type="table" w:styleId="ColorfulGrid-Accent5">
     <w:name w:val="Colorful Grid Accent 5"/>
     <w:basedOn w:val="TableNormal"/>
     <w:uiPriority w:val="73"/>
@@ -11895,7 +12028,7 @@
       </w:tcPr>
     </w:tblStylePr>
   </w:style>
-  <w:style w:type="table" w:styleId="ColourfulGridAccent6">
+  <w:style w:type="table" w:styleId="ColorfulGrid-Accent6">
     <w:name w:val="Colorful Grid Accent 6"/>
     <w:basedOn w:val="TableNormal"/>
     <w:uiPriority w:val="73"/>

</xml_diff>